<commit_message>
Edit AI-009 task, output, verification and what changed
</commit_message>
<xml_diff>
--- a/assignments/assignment 3/SEN381 Assignment 3.docx
+++ b/assignments/assignment 3/SEN381 Assignment 3.docx
@@ -13,7 +13,6 @@
           <w:docPartUnique/>
         </w:docPartObj>
       </w:sdtPr>
-      <w:sdtEndPr/>
       <w:sdtContent>
         <w:p>
           <w:pPr>
@@ -97,7 +96,6 @@
                                   <w:dataBinding w:prefixMappings="xmlns:ns0='http://schemas.openxmlformats.org/package/2006/metadata/core-properties' xmlns:ns1='http://purl.org/dc/elements/1.1/'" w:xpath="/ns0:coreProperties[1]/ns1:title[1]" w:storeItemID="{6C3C8BC8-F283-45AE-878A-BAB7291924A1}"/>
                                   <w:text/>
                                 </w:sdtPr>
-                                <w:sdtEndPr/>
                                 <w:sdtContent>
                                   <w:p>
                                     <w:pPr>
@@ -152,7 +150,6 @@
                                   <w:dataBinding w:prefixMappings="xmlns:ns0='http://schemas.microsoft.com/office/2006/coverPageProps'" w:xpath="/ns0:CoverPageProperties[1]/ns0:Abstract[1]" w:storeItemID="{55AF091B-3C7A-41E3-B477-F2FDAA23CFDA}"/>
                                   <w:text/>
                                 </w:sdtPr>
-                                <w:sdtEndPr/>
                                 <w:sdtContent>
                                   <w:p>
                                     <w:pPr>
@@ -435,7 +432,6 @@
                                   <w:dataBinding w:prefixMappings="xmlns:ns0='http://schemas.openxmlformats.org/package/2006/metadata/core-properties' xmlns:ns1='http://purl.org/dc/elements/1.1/'" w:xpath="/ns0:coreProperties[1]/ns1:subject[1]" w:storeItemID="{6C3C8BC8-F283-45AE-878A-BAB7291924A1}"/>
                                   <w:text/>
                                 </w:sdtPr>
-                                <w:sdtEndPr/>
                                 <w:sdtContent>
                                   <w:p>
                                     <w:pPr>
@@ -456,55 +452,7 @@
                                         <w:szCs w:val="14"/>
                                         <w14:ligatures w14:val="none"/>
                                       </w:rPr>
-                                      <w:t xml:space="preserve">Benno Weideman 602904 </w:t>
-                                    </w:r>
-                                    <w:proofErr w:type="spellStart"/>
-                                    <w:r>
-                                      <w:rPr>
-                                        <w:rFonts w:ascii="Times New Roman" w:hAnsi="Times New Roman" w:cs="Times New Roman"/>
-                                        <w:color w:val="FFFFFF" w:themeColor="background1"/>
-                                        <w:kern w:val="0"/>
-                                        <w:sz w:val="14"/>
-                                        <w:szCs w:val="14"/>
-                                        <w14:ligatures w14:val="none"/>
-                                      </w:rPr>
-                                      <w:t>Mohau</w:t>
-                                    </w:r>
-                                    <w:proofErr w:type="spellEnd"/>
-                                    <w:r>
-                                      <w:rPr>
-                                        <w:rFonts w:ascii="Times New Roman" w:hAnsi="Times New Roman" w:cs="Times New Roman"/>
-                                        <w:color w:val="FFFFFF" w:themeColor="background1"/>
-                                        <w:kern w:val="0"/>
-                                        <w:sz w:val="14"/>
-                                        <w:szCs w:val="14"/>
-                                        <w14:ligatures w14:val="none"/>
-                                      </w:rPr>
-                                      <w:t xml:space="preserve"> Drew </w:t>
-                                    </w:r>
-                                    <w:proofErr w:type="spellStart"/>
-                                    <w:r>
-                                      <w:rPr>
-                                        <w:rFonts w:ascii="Times New Roman" w:hAnsi="Times New Roman" w:cs="Times New Roman"/>
-                                        <w:color w:val="FFFFFF" w:themeColor="background1"/>
-                                        <w:kern w:val="0"/>
-                                        <w:sz w:val="14"/>
-                                        <w:szCs w:val="14"/>
-                                        <w14:ligatures w14:val="none"/>
-                                      </w:rPr>
-                                      <w:t>Modiselle</w:t>
-                                    </w:r>
-                                    <w:proofErr w:type="spellEnd"/>
-                                    <w:r>
-                                      <w:rPr>
-                                        <w:rFonts w:ascii="Times New Roman" w:hAnsi="Times New Roman" w:cs="Times New Roman"/>
-                                        <w:color w:val="FFFFFF" w:themeColor="background1"/>
-                                        <w:kern w:val="0"/>
-                                        <w:sz w:val="14"/>
-                                        <w:szCs w:val="14"/>
-                                        <w14:ligatures w14:val="none"/>
-                                      </w:rPr>
-                                      <w:t xml:space="preserve"> 602295 Tammy Fourie 601264</w:t>
+                                      <w:t>Benno Weideman 602904 Mohau Drew Modiselle 602295 Tammy Fourie 601264</w:t>
                                     </w:r>
                                   </w:p>
                                 </w:sdtContent>
@@ -3765,25 +3713,7 @@
                 <w:sz w:val="20"/>
                 <w:szCs w:val="20"/>
               </w:rPr>
-              <w:t xml:space="preserve">Mean Time </w:t>
-            </w:r>
-            <w:proofErr w:type="gramStart"/>
-            <w:r>
-              <w:rPr>
-                <w:rFonts w:ascii="Times New Roman" w:hAnsi="Times New Roman" w:cs="Times New Roman"/>
-                <w:sz w:val="20"/>
-                <w:szCs w:val="20"/>
-              </w:rPr>
-              <w:t>To</w:t>
-            </w:r>
-            <w:proofErr w:type="gramEnd"/>
-            <w:r>
-              <w:rPr>
-                <w:rFonts w:ascii="Times New Roman" w:hAnsi="Times New Roman" w:cs="Times New Roman"/>
-                <w:sz w:val="20"/>
-                <w:szCs w:val="20"/>
-              </w:rPr>
-              <w:t xml:space="preserve"> Recovery</w:t>
+              <w:t>Mean Time To Recovery</w:t>
             </w:r>
           </w:p>
         </w:tc>
@@ -4202,7 +4132,6 @@
           <w:id w:val="-1863818320"/>
           <w:citation/>
         </w:sdtPr>
-        <w:sdtEndPr/>
         <w:sdtContent>
           <w:r>
             <w:rPr>
@@ -4265,7 +4194,6 @@
           <w:id w:val="397563685"/>
           <w:citation/>
         </w:sdtPr>
-        <w:sdtEndPr/>
         <w:sdtContent>
           <w:r>
             <w:rPr>
@@ -4373,7 +4301,6 @@
           <w:id w:val="1548480007"/>
           <w:citation/>
         </w:sdtPr>
-        <w:sdtEndPr/>
         <w:sdtContent>
           <w:r>
             <w:rPr>
@@ -4669,7 +4596,6 @@
                 <w:id w:val="1985503051"/>
                 <w:citation/>
               </w:sdtPr>
-              <w:sdtEndPr/>
               <w:sdtContent>
                 <w:r>
                   <w:rPr>
@@ -4754,7 +4680,6 @@
                 <w:id w:val="-1988317436"/>
                 <w:citation/>
               </w:sdtPr>
-              <w:sdtEndPr/>
               <w:sdtContent>
                 <w:r>
                   <w:rPr>
@@ -4839,7 +4764,6 @@
                 <w:id w:val="923763849"/>
                 <w:citation/>
               </w:sdtPr>
-              <w:sdtEndPr/>
               <w:sdtContent>
                 <w:r>
                   <w:rPr>
@@ -4924,7 +4848,6 @@
                 <w:id w:val="-1054618309"/>
                 <w:citation/>
               </w:sdtPr>
-              <w:sdtEndPr/>
               <w:sdtContent>
                 <w:r>
                   <w:rPr>
@@ -5038,7 +4961,6 @@
                 <w:id w:val="-365379269"/>
                 <w:citation/>
               </w:sdtPr>
-              <w:sdtEndPr/>
               <w:sdtContent>
                 <w:r>
                   <w:rPr>
@@ -5123,7 +5045,6 @@
                 <w:id w:val="244078227"/>
                 <w:citation/>
               </w:sdtPr>
-              <w:sdtEndPr/>
               <w:sdtContent>
                 <w:r>
                   <w:rPr>
@@ -5208,7 +5129,6 @@
                 <w:id w:val="-1692292084"/>
                 <w:citation/>
               </w:sdtPr>
-              <w:sdtEndPr/>
               <w:sdtContent>
                 <w:r>
                   <w:rPr>
@@ -5293,7 +5213,6 @@
                 <w:id w:val="1448434562"/>
                 <w:citation/>
               </w:sdtPr>
-              <w:sdtEndPr/>
               <w:sdtContent>
                 <w:r>
                   <w:rPr>
@@ -5407,7 +5326,6 @@
                 <w:id w:val="-216125537"/>
                 <w:citation/>
               </w:sdtPr>
-              <w:sdtEndPr/>
               <w:sdtContent>
                 <w:r>
                   <w:rPr>
@@ -5492,7 +5410,6 @@
                 <w:id w:val="-1182354526"/>
                 <w:citation/>
               </w:sdtPr>
-              <w:sdtEndPr/>
               <w:sdtContent>
                 <w:r>
                   <w:rPr>
@@ -5577,7 +5494,6 @@
                 <w:id w:val="-163550635"/>
                 <w:citation/>
               </w:sdtPr>
-              <w:sdtEndPr/>
               <w:sdtContent>
                 <w:r>
                   <w:rPr>
@@ -5662,7 +5578,6 @@
                 <w:id w:val="-913623644"/>
                 <w:citation/>
               </w:sdtPr>
-              <w:sdtEndPr/>
               <w:sdtContent>
                 <w:r>
                   <w:rPr>
@@ -5781,7 +5696,6 @@
           <w:id w:val="-515078836"/>
           <w:citation/>
         </w:sdtPr>
-        <w:sdtEndPr/>
         <w:sdtContent>
           <w:r>
             <w:rPr>
@@ -6511,43 +6425,7 @@
           <w:sz w:val="16"/>
           <w:szCs w:val="16"/>
         </w:rPr>
-        <w:t xml:space="preserve">Security is strongest when it is treated as a continuous engineering concern: teams identify assets and plausible misuse early, convert those threats into verifiable requirements, design controls into the architecture, implement them defensibly and retain evidence that the controls work. A final penetration test remains </w:t>
-      </w:r>
-      <w:proofErr w:type="gramStart"/>
-      <w:r>
-        <w:rPr>
-          <w:rFonts w:ascii="Times New Roman" w:hAnsi="Times New Roman" w:cs="Times New Roman"/>
-          <w:sz w:val="16"/>
-          <w:szCs w:val="16"/>
-        </w:rPr>
-        <w:t>valuable</w:t>
-      </w:r>
-      <w:proofErr w:type="gramEnd"/>
-      <w:r>
-        <w:rPr>
-          <w:rFonts w:ascii="Times New Roman" w:hAnsi="Times New Roman" w:cs="Times New Roman"/>
-          <w:sz w:val="16"/>
-          <w:szCs w:val="16"/>
-        </w:rPr>
-        <w:t xml:space="preserve"> but it samples one deployed state and cannot economically repair architectural weaknesses discovered late. NIST's Secure Software Development Framework therefore integrates security practices across preparation, protection of software, production of well-secured software and response to vulnerabilities rather than assigning security to one end-stage test (</w:t>
-      </w:r>
-      <w:proofErr w:type="spellStart"/>
-      <w:r>
-        <w:rPr>
-          <w:rFonts w:ascii="Times New Roman" w:hAnsi="Times New Roman" w:cs="Times New Roman"/>
-          <w:sz w:val="16"/>
-          <w:szCs w:val="16"/>
-        </w:rPr>
-        <w:t>Souppaya</w:t>
-      </w:r>
-      <w:proofErr w:type="spellEnd"/>
-      <w:r>
-        <w:rPr>
-          <w:rFonts w:ascii="Times New Roman" w:hAnsi="Times New Roman" w:cs="Times New Roman"/>
-          <w:sz w:val="16"/>
-          <w:szCs w:val="16"/>
-        </w:rPr>
-        <w:t>, Scarfone &amp; Dodson, 2022).</w:t>
+        <w:t>Security is strongest when it is treated as a continuous engineering concern: teams identify assets and plausible misuse early, convert those threats into verifiable requirements, design controls into the architecture, implement them defensibly and retain evidence that the controls work. A final penetration test remains valuable but it samples one deployed state and cannot economically repair architectural weaknesses discovered late. NIST's Secure Software Development Framework therefore integrates security practices across preparation, protection of software, production of well-secured software and response to vulnerabilities rather than assigning security to one end-stage test (Souppaya, Scarfone &amp; Dodson, 2022).</w:t>
       </w:r>
     </w:p>
     <w:p>
@@ -6635,25 +6513,7 @@
           <w:sz w:val="16"/>
           <w:szCs w:val="16"/>
         </w:rPr>
-        <w:t xml:space="preserve">A useful workflow is iterative: model a feature during design, record threat-to-control links in the backlog, review the model when trust boundaries or data flows change and compare implemented evidence with the original assumptions. Risk ranking should consider plausible attacker capability, likelihood, affected data or service, impact and control confidence. This research does not determine which </w:t>
-      </w:r>
-      <w:proofErr w:type="spellStart"/>
-      <w:r>
-        <w:rPr>
-          <w:rFonts w:ascii="Times New Roman" w:hAnsi="Times New Roman" w:cs="Times New Roman"/>
-          <w:sz w:val="16"/>
-          <w:szCs w:val="16"/>
-        </w:rPr>
-        <w:t>CivicConnect</w:t>
-      </w:r>
-      <w:proofErr w:type="spellEnd"/>
-      <w:r>
-        <w:rPr>
-          <w:rFonts w:ascii="Times New Roman" w:hAnsi="Times New Roman" w:cs="Times New Roman"/>
-          <w:sz w:val="16"/>
-          <w:szCs w:val="16"/>
-        </w:rPr>
-        <w:t xml:space="preserve"> threats are highest; Milestone 3 must make that judgement using the actual architecture and evidence.</w:t>
+        <w:t>A useful workflow is iterative: model a feature during design, record threat-to-control links in the backlog, review the model when trust boundaries or data flows change and compare implemented evidence with the original assumptions. Risk ranking should consider plausible attacker capability, likelihood, affected data or service, impact and control confidence. This research does not determine which CivicConnect threats are highest; Milestone 3 must make that judgement using the actual architecture and evidence.</w:t>
       </w:r>
     </w:p>
     <w:p>
@@ -6690,25 +6550,7 @@
           <w:sz w:val="16"/>
           <w:szCs w:val="16"/>
         </w:rPr>
-        <w:t xml:space="preserve">Table 1 traces four representative concern areas. Each row is a candidate reasoning chain for a modern web system, not a declaration that </w:t>
-      </w:r>
-      <w:proofErr w:type="spellStart"/>
-      <w:r>
-        <w:rPr>
-          <w:rFonts w:ascii="Times New Roman" w:hAnsi="Times New Roman" w:cs="Times New Roman"/>
-          <w:sz w:val="16"/>
-          <w:szCs w:val="16"/>
-        </w:rPr>
-        <w:t>CivicConnect</w:t>
-      </w:r>
-      <w:proofErr w:type="spellEnd"/>
-      <w:r>
-        <w:rPr>
-          <w:rFonts w:ascii="Times New Roman" w:hAnsi="Times New Roman" w:cs="Times New Roman"/>
-          <w:sz w:val="16"/>
-          <w:szCs w:val="16"/>
-        </w:rPr>
-        <w:t xml:space="preserve"> has selected the control.</w:t>
+        <w:t>Table 1 traces four representative concern areas. Each row is a candidate reasoning chain for a modern web system, not a declaration that CivicConnect has selected the control.</w:t>
       </w:r>
     </w:p>
     <w:tbl>
@@ -6995,61 +6837,7 @@
                 <w:sz w:val="16"/>
                 <w:szCs w:val="16"/>
               </w:rPr>
-              <w:t>Candidate controls include centrally enforced authentication, breached-password screening, rate limits, secure password hashing, MFA for higher-risk actions, short-lived and rotated sessions, Secure/</w:t>
-            </w:r>
-            <w:proofErr w:type="spellStart"/>
-            <w:r>
-              <w:rPr>
-                <w:rFonts w:ascii="Times New Roman" w:hAnsi="Times New Roman" w:cs="Times New Roman"/>
-                <w:sz w:val="16"/>
-                <w:szCs w:val="16"/>
-              </w:rPr>
-              <w:t>HttpOnly</w:t>
-            </w:r>
-            <w:proofErr w:type="spellEnd"/>
-            <w:r>
-              <w:rPr>
-                <w:rFonts w:ascii="Times New Roman" w:hAnsi="Times New Roman" w:cs="Times New Roman"/>
-                <w:sz w:val="16"/>
-                <w:szCs w:val="16"/>
-              </w:rPr>
-              <w:t>/</w:t>
-            </w:r>
-            <w:proofErr w:type="spellStart"/>
-            <w:r>
-              <w:rPr>
-                <w:rFonts w:ascii="Times New Roman" w:hAnsi="Times New Roman" w:cs="Times New Roman"/>
-                <w:sz w:val="16"/>
-                <w:szCs w:val="16"/>
-              </w:rPr>
-              <w:t>SameSite</w:t>
-            </w:r>
-            <w:proofErr w:type="spellEnd"/>
-            <w:r>
-              <w:rPr>
-                <w:rFonts w:ascii="Times New Roman" w:hAnsi="Times New Roman" w:cs="Times New Roman"/>
-                <w:sz w:val="16"/>
-                <w:szCs w:val="16"/>
-              </w:rPr>
-              <w:t xml:space="preserve"> cookies and re-authentication before sensitive changes. NIST SP 800-63B-4 treats authentication assurance, verifier compromise and phishing resistance as distinct design concerns (</w:t>
-            </w:r>
-            <w:proofErr w:type="spellStart"/>
-            <w:r>
-              <w:rPr>
-                <w:rFonts w:ascii="Times New Roman" w:hAnsi="Times New Roman" w:cs="Times New Roman"/>
-                <w:sz w:val="16"/>
-                <w:szCs w:val="16"/>
-              </w:rPr>
-              <w:t>Temoshok</w:t>
-            </w:r>
-            <w:proofErr w:type="spellEnd"/>
-            <w:r>
-              <w:rPr>
-                <w:rFonts w:ascii="Times New Roman" w:hAnsi="Times New Roman" w:cs="Times New Roman"/>
-                <w:sz w:val="16"/>
-                <w:szCs w:val="16"/>
-              </w:rPr>
-              <w:t xml:space="preserve"> et al., 2025).</w:t>
+              <w:t>Candidate controls include centrally enforced authentication, breached-password screening, rate limits, secure password hashing, MFA for higher-risk actions, short-lived and rotated sessions, Secure/HttpOnly/SameSite cookies and re-authentication before sensitive changes. NIST SP 800-63B-4 treats authentication assurance, verifier compromise and phishing resistance as distinct design concerns (Temoshok et al., 2025).</w:t>
             </w:r>
           </w:p>
         </w:tc>
@@ -7109,25 +6897,7 @@
                 <w:sz w:val="16"/>
                 <w:szCs w:val="16"/>
               </w:rPr>
-              <w:t xml:space="preserve">MFA may still be </w:t>
-            </w:r>
-            <w:proofErr w:type="spellStart"/>
-            <w:r>
-              <w:rPr>
-                <w:rFonts w:ascii="Times New Roman" w:hAnsi="Times New Roman" w:cs="Times New Roman"/>
-                <w:sz w:val="16"/>
-                <w:szCs w:val="16"/>
-              </w:rPr>
-              <w:t>phishable</w:t>
-            </w:r>
-            <w:proofErr w:type="spellEnd"/>
-            <w:r>
-              <w:rPr>
-                <w:rFonts w:ascii="Times New Roman" w:hAnsi="Times New Roman" w:cs="Times New Roman"/>
-                <w:sz w:val="16"/>
-                <w:szCs w:val="16"/>
-              </w:rPr>
-              <w:t>; recovery can become the weakest path; distributed low-rate attacks can evade thresholds; valid credentials may already be compromised; usability and availability trade-offs remain.</w:t>
+              <w:t>MFA may still be phishable; recovery can become the weakest path; distributed low-rate attacks can evade thresholds; valid credentials may already be compromised; usability and availability trade-offs remain.</w:t>
             </w:r>
           </w:p>
         </w:tc>
@@ -7536,43 +7306,7 @@
                 <w:sz w:val="16"/>
                 <w:szCs w:val="16"/>
               </w:rPr>
-              <w:t xml:space="preserve">Candidate controls include parameterised queries, safe framework APIs, allow-list validation at trust boundaries, </w:t>
-            </w:r>
-            <w:proofErr w:type="spellStart"/>
-            <w:r>
-              <w:rPr>
-                <w:rFonts w:ascii="Times New Roman" w:hAnsi="Times New Roman" w:cs="Times New Roman"/>
-                <w:sz w:val="16"/>
-                <w:szCs w:val="16"/>
-              </w:rPr>
-              <w:t>canonicalisation</w:t>
-            </w:r>
-            <w:proofErr w:type="spellEnd"/>
-            <w:r>
-              <w:rPr>
-                <w:rFonts w:ascii="Times New Roman" w:hAnsi="Times New Roman" w:cs="Times New Roman"/>
-                <w:sz w:val="16"/>
-                <w:szCs w:val="16"/>
-              </w:rPr>
-              <w:t xml:space="preserve"> before validation, contextual output encoding, safe file handling, request-size limits and least-privilege database accounts. SQL-injection research shows that attacks exploit unchecked input reaching query construction and that countermeasures differ in coverage (</w:t>
-            </w:r>
-            <w:proofErr w:type="spellStart"/>
-            <w:r>
-              <w:rPr>
-                <w:rFonts w:ascii="Times New Roman" w:hAnsi="Times New Roman" w:cs="Times New Roman"/>
-                <w:sz w:val="16"/>
-                <w:szCs w:val="16"/>
-              </w:rPr>
-              <w:t>Halfond</w:t>
-            </w:r>
-            <w:proofErr w:type="spellEnd"/>
-            <w:r>
-              <w:rPr>
-                <w:rFonts w:ascii="Times New Roman" w:hAnsi="Times New Roman" w:cs="Times New Roman"/>
-                <w:sz w:val="16"/>
-                <w:szCs w:val="16"/>
-              </w:rPr>
-              <w:t>, Viegas &amp; Orso, 2006).</w:t>
+              <w:t>Candidate controls include parameterised queries, safe framework APIs, allow-list validation at trust boundaries, canonicalisation before validation, contextual output encoding, safe file handling, request-size limits and least-privilege database accounts. SQL-injection research shows that attacks exploit unchecked input reaching query construction and that countermeasures differ in coverage (Halfond, Viegas &amp; Orso, 2006).</w:t>
             </w:r>
           </w:p>
         </w:tc>
@@ -7672,25 +7406,7 @@
           <w:sz w:val="16"/>
           <w:szCs w:val="16"/>
         </w:rPr>
-        <w:t xml:space="preserve">Secure design decides the security properties and architecture: trust boundaries, identity flows, access policy, data classification, failure behaviour and containment. It can prevent whole classes of weakness, but a sound design can be implemented incorrectly. Secure coding realises the design through safe APIs, defensive input handling, correct cryptography use, error handling and review. Coding discipline, </w:t>
-      </w:r>
-      <w:proofErr w:type="gramStart"/>
-      <w:r>
-        <w:rPr>
-          <w:rFonts w:ascii="Times New Roman" w:hAnsi="Times New Roman" w:cs="Times New Roman"/>
-          <w:sz w:val="16"/>
-          <w:szCs w:val="16"/>
-        </w:rPr>
-        <w:t>however</w:t>
-      </w:r>
-      <w:proofErr w:type="gramEnd"/>
-      <w:r>
-        <w:rPr>
-          <w:rFonts w:ascii="Times New Roman" w:hAnsi="Times New Roman" w:cs="Times New Roman"/>
-          <w:sz w:val="16"/>
-          <w:szCs w:val="16"/>
-        </w:rPr>
-        <w:t xml:space="preserve"> cannot compensate for a missing authorisation model or an over-privileged architecture.</w:t>
+        <w:t>Secure design decides the security properties and architecture: trust boundaries, identity flows, access policy, data classification, failure behaviour and containment. It can prevent whole classes of weakness, but a sound design can be implemented incorrectly. Secure coding realises the design through safe APIs, defensive input handling, correct cryptography use, error handling and review. Coding discipline, however cannot compensate for a missing authorisation model or an over-privileged architecture.</w:t>
       </w:r>
     </w:p>
     <w:p>
@@ -7707,25 +7423,7 @@
           <w:sz w:val="16"/>
           <w:szCs w:val="16"/>
         </w:rPr>
-        <w:t>Dependency and security checks provide another layer. Software-composition analysis can reveal known vulnerable components and licence or provenance concerns; secret scanning can detect exposed credentials; static analysis can identify some dangerous data flows; dynamic testing and penetration testing exercise running behaviour. These checks find departures from design and construction expectations, but they are bounded by rules, visibility, configuration and test data. The SSDF therefore treats security requirements, design review, protected development environments, code review, testing and vulnerability response as mutually reinforcing practices (</w:t>
-      </w:r>
-      <w:proofErr w:type="spellStart"/>
-      <w:r>
-        <w:rPr>
-          <w:rFonts w:ascii="Times New Roman" w:hAnsi="Times New Roman" w:cs="Times New Roman"/>
-          <w:sz w:val="16"/>
-          <w:szCs w:val="16"/>
-        </w:rPr>
-        <w:t>Souppaya</w:t>
-      </w:r>
-      <w:proofErr w:type="spellEnd"/>
-      <w:r>
-        <w:rPr>
-          <w:rFonts w:ascii="Times New Roman" w:hAnsi="Times New Roman" w:cs="Times New Roman"/>
-          <w:sz w:val="16"/>
-          <w:szCs w:val="16"/>
-        </w:rPr>
-        <w:t>, Scarfone &amp; Dodson, 2022). The defensible claim is not that one layer makes the system secure, but that independent layers reduce different failure modes and produce complementary evidence.</w:t>
+        <w:t>Dependency and security checks provide another layer. Software-composition analysis can reveal known vulnerable components and licence or provenance concerns; secret scanning can detect exposed credentials; static analysis can identify some dangerous data flows; dynamic testing and penetration testing exercise running behaviour. These checks find departures from design and construction expectations, but they are bounded by rules, visibility, configuration and test data. The SSDF therefore treats security requirements, design review, protected development environments, code review, testing and vulnerability response as mutually reinforcing practices (Souppaya, Scarfone &amp; Dodson, 2022). The defensible claim is not that one layer makes the system secure, but that independent layers reduce different failure modes and produce complementary evidence.</w:t>
       </w:r>
     </w:p>
     <w:p>
@@ -7926,25 +7624,7 @@
           <w:sz w:val="16"/>
           <w:szCs w:val="16"/>
         </w:rPr>
-        <w:t xml:space="preserve">Milestone 3 must still determine which threats are credible for </w:t>
-      </w:r>
-      <w:proofErr w:type="spellStart"/>
-      <w:r>
-        <w:rPr>
-          <w:rFonts w:ascii="Times New Roman" w:hAnsi="Times New Roman" w:cs="Times New Roman"/>
-          <w:sz w:val="16"/>
-          <w:szCs w:val="16"/>
-        </w:rPr>
-        <w:t>CivicConnect</w:t>
-      </w:r>
-      <w:proofErr w:type="spellEnd"/>
-      <w:r>
-        <w:rPr>
-          <w:rFonts w:ascii="Times New Roman" w:hAnsi="Times New Roman" w:cs="Times New Roman"/>
-          <w:sz w:val="16"/>
-          <w:szCs w:val="16"/>
-        </w:rPr>
-        <w:t>, which assets and trust boundaries matter most, the assurance level required, which controls fit its actual technology and constraints, what evidence is sufficient and which residual risks can be accepted. This preserves the assignment's research-versus-project-decision boundary.</w:t>
+        <w:t>Milestone 3 must still determine which threats are credible for CivicConnect, which assets and trust boundaries matter most, the assurance level required, which controls fit its actual technology and constraints, what evidence is sufficient and which residual risks can be accepted. This preserves the assignment's research-versus-project-decision boundary.</w:t>
       </w:r>
     </w:p>
     <w:p>
@@ -8059,25 +7739,7 @@
           <w:sz w:val="16"/>
           <w:szCs w:val="16"/>
         </w:rPr>
-        <w:t xml:space="preserve">Production ready applications strictly separate configuration from source code. Hardcoding secrets such as API keys or database credentials directly into the codebase introduces catastrophic security risks and makes credential rotation impossible without recompiling the application. Modern practices dictate that </w:t>
-      </w:r>
-      <w:proofErr w:type="gramStart"/>
-      <w:r>
-        <w:rPr>
-          <w:rFonts w:ascii="Times New Roman" w:hAnsi="Times New Roman" w:cs="Times New Roman"/>
-          <w:sz w:val="16"/>
-          <w:szCs w:val="16"/>
-        </w:rPr>
-        <w:t>configuration</w:t>
-      </w:r>
-      <w:proofErr w:type="gramEnd"/>
-      <w:r>
-        <w:rPr>
-          <w:rFonts w:ascii="Times New Roman" w:hAnsi="Times New Roman" w:cs="Times New Roman"/>
-          <w:sz w:val="16"/>
-          <w:szCs w:val="16"/>
-        </w:rPr>
-        <w:t xml:space="preserve"> and secrets must only be injected at runtime, ensuring that developers never have direct access to production credential (Humble, 2018).</w:t>
+        <w:t>Production ready applications strictly separate configuration from source code. Hardcoding secrets such as API keys or database credentials directly into the codebase introduces catastrophic security risks and makes credential rotation impossible without recompiling the application. Modern practices dictate that configuration and secrets must only be injected at runtime, ensuring that developers never have direct access to production credential (Humble, 2018).</w:t>
       </w:r>
     </w:p>
     <w:p>
@@ -8151,25 +7813,7 @@
           <w:sz w:val="16"/>
           <w:szCs w:val="16"/>
         </w:rPr>
-        <w:t xml:space="preserve">Production readiness requires proven recovery mechanisms. This is because it is inevitable that deployments will fail. Any automated deployment pipeline must be paired with an automated rollback strategy. Rolling back application code can however be dangerous if the database schema has been changed. This requires teams to engineer backward-compatible database migrations (evolutionary database design), ensuring that if a new release introduces a fatal bug, reverting to the previous application version will not result in data corruption or application crashes due to missing columns or tables (Amber &amp; </w:t>
-      </w:r>
-      <w:proofErr w:type="spellStart"/>
-      <w:r>
-        <w:rPr>
-          <w:rFonts w:ascii="Times New Roman" w:hAnsi="Times New Roman" w:cs="Times New Roman"/>
-          <w:sz w:val="16"/>
-          <w:szCs w:val="16"/>
-        </w:rPr>
-        <w:t>Sadalage</w:t>
-      </w:r>
-      <w:proofErr w:type="spellEnd"/>
-      <w:r>
-        <w:rPr>
-          <w:rFonts w:ascii="Times New Roman" w:hAnsi="Times New Roman" w:cs="Times New Roman"/>
-          <w:sz w:val="16"/>
-          <w:szCs w:val="16"/>
-        </w:rPr>
-        <w:t>, 2006).</w:t>
+        <w:t>Production readiness requires proven recovery mechanisms. This is because it is inevitable that deployments will fail. Any automated deployment pipeline must be paired with an automated rollback strategy. Rolling back application code can however be dangerous if the database schema has been changed. This requires teams to engineer backward-compatible database migrations (evolutionary database design), ensuring that if a new release introduces a fatal bug, reverting to the previous application version will not result in data corruption or application crashes due to missing columns or tables (Amber &amp; Sadalage, 2006).</w:t>
       </w:r>
     </w:p>
     <w:p>
@@ -8206,25 +7850,7 @@
           <w:sz w:val="16"/>
           <w:szCs w:val="16"/>
         </w:rPr>
-        <w:t xml:space="preserve">Observability is the ability to understand the internal state of a system by analysing </w:t>
-      </w:r>
-      <w:proofErr w:type="gramStart"/>
-      <w:r>
-        <w:rPr>
-          <w:rFonts w:ascii="Times New Roman" w:hAnsi="Times New Roman" w:cs="Times New Roman"/>
-          <w:sz w:val="16"/>
-          <w:szCs w:val="16"/>
-        </w:rPr>
-        <w:t>it’s</w:t>
-      </w:r>
-      <w:proofErr w:type="gramEnd"/>
-      <w:r>
-        <w:rPr>
-          <w:rFonts w:ascii="Times New Roman" w:hAnsi="Times New Roman" w:cs="Times New Roman"/>
-          <w:sz w:val="16"/>
-          <w:szCs w:val="16"/>
-        </w:rPr>
-        <w:t xml:space="preserve"> external outputs, moving beyond basic monitoring to active system diagnosis. It relies on three telemetry pillars:</w:t>
+        <w:t>Observability is the ability to understand the internal state of a system by analysing it’s external outputs, moving beyond basic monitoring to active system diagnosis. It relies on three telemetry pillars:</w:t>
       </w:r>
     </w:p>
     <w:p>
@@ -8538,10 +8164,19 @@
                 <w:sz w:val="16"/>
                 <w:szCs w:val="16"/>
               </w:rPr>
-              <w:t xml:space="preserve">Risk if </w:t>
-            </w:r>
-            <w:proofErr w:type="gramStart"/>
-            <w:r>
+              <w:t>Risk if Ignored</w:t>
+            </w:r>
+          </w:p>
+        </w:tc>
+        <w:tc>
+          <w:tcPr>
+            <w:tcW w:w="0" w:type="auto"/>
+            <w:shd w:val="clear" w:color="auto" w:fill="0E2841" w:themeFill="text2"/>
+          </w:tcPr>
+          <w:p>
+            <w:pPr>
+              <w:pStyle w:val="ListParagraph"/>
+              <w:ind w:left="0"/>
               <w:rPr>
                 <w:rFonts w:ascii="Times New Roman" w:hAnsi="Times New Roman" w:cs="Times New Roman"/>
                 <w:b/>
@@ -8549,9 +8184,17 @@
                 <w:sz w:val="16"/>
                 <w:szCs w:val="16"/>
               </w:rPr>
-              <w:t>Ignored</w:t>
-            </w:r>
-            <w:proofErr w:type="gramEnd"/>
+            </w:pPr>
+            <w:r>
+              <w:rPr>
+                <w:rFonts w:ascii="Times New Roman" w:hAnsi="Times New Roman" w:cs="Times New Roman"/>
+                <w:b/>
+                <w:bCs/>
+                <w:sz w:val="16"/>
+                <w:szCs w:val="16"/>
+              </w:rPr>
+              <w:t>Evidence Required Before Release</w:t>
+            </w:r>
           </w:p>
         </w:tc>
         <w:tc>
@@ -8579,10 +8222,12 @@
                 <w:sz w:val="16"/>
                 <w:szCs w:val="16"/>
               </w:rPr>
-              <w:t>Evidence Required Before Release</w:t>
-            </w:r>
-          </w:p>
-        </w:tc>
+              <w:t>Evidence Observed After Release</w:t>
+            </w:r>
+          </w:p>
+        </w:tc>
+      </w:tr>
+      <w:tr>
         <w:tc>
           <w:tcPr>
             <w:tcW w:w="0" w:type="auto"/>
@@ -8608,7 +8253,79 @@
                 <w:sz w:val="16"/>
                 <w:szCs w:val="16"/>
               </w:rPr>
-              <w:t>Evidence Observed After Release</w:t>
+              <w:t>Environment Drift</w:t>
+            </w:r>
+          </w:p>
+        </w:tc>
+        <w:tc>
+          <w:tcPr>
+            <w:tcW w:w="0" w:type="auto"/>
+          </w:tcPr>
+          <w:p>
+            <w:pPr>
+              <w:pStyle w:val="ListParagraph"/>
+              <w:ind w:left="0"/>
+              <w:rPr>
+                <w:rFonts w:ascii="Times New Roman" w:hAnsi="Times New Roman" w:cs="Times New Roman"/>
+                <w:sz w:val="16"/>
+                <w:szCs w:val="16"/>
+              </w:rPr>
+            </w:pPr>
+            <w:r>
+              <w:rPr>
+                <w:rFonts w:ascii="Times New Roman" w:hAnsi="Times New Roman" w:cs="Times New Roman"/>
+                <w:sz w:val="16"/>
+                <w:szCs w:val="16"/>
+              </w:rPr>
+              <w:t>Software works in staging but crashes in production due to OS or dependency mismatches.</w:t>
+            </w:r>
+          </w:p>
+        </w:tc>
+        <w:tc>
+          <w:tcPr>
+            <w:tcW w:w="0" w:type="auto"/>
+          </w:tcPr>
+          <w:p>
+            <w:pPr>
+              <w:pStyle w:val="ListParagraph"/>
+              <w:ind w:left="0"/>
+              <w:rPr>
+                <w:rFonts w:ascii="Times New Roman" w:hAnsi="Times New Roman" w:cs="Times New Roman"/>
+                <w:sz w:val="16"/>
+                <w:szCs w:val="16"/>
+              </w:rPr>
+            </w:pPr>
+            <w:r>
+              <w:rPr>
+                <w:rFonts w:ascii="Times New Roman" w:hAnsi="Times New Roman" w:cs="Times New Roman"/>
+                <w:sz w:val="16"/>
+                <w:szCs w:val="16"/>
+              </w:rPr>
+              <w:t>Infrastructure-as-Code (IaC) scripts and immutable container images.</w:t>
+            </w:r>
+          </w:p>
+        </w:tc>
+        <w:tc>
+          <w:tcPr>
+            <w:tcW w:w="0" w:type="auto"/>
+          </w:tcPr>
+          <w:p>
+            <w:pPr>
+              <w:pStyle w:val="ListParagraph"/>
+              <w:ind w:left="0"/>
+              <w:rPr>
+                <w:rFonts w:ascii="Times New Roman" w:hAnsi="Times New Roman" w:cs="Times New Roman"/>
+                <w:sz w:val="16"/>
+                <w:szCs w:val="16"/>
+              </w:rPr>
+            </w:pPr>
+            <w:r>
+              <w:rPr>
+                <w:rFonts w:ascii="Times New Roman" w:hAnsi="Times New Roman" w:cs="Times New Roman"/>
+                <w:sz w:val="16"/>
+                <w:szCs w:val="16"/>
+              </w:rPr>
+              <w:t>Configuration drift monitoring and environment parity audits.</w:t>
             </w:r>
           </w:p>
         </w:tc>
@@ -8639,7 +8356,7 @@
                 <w:sz w:val="16"/>
                 <w:szCs w:val="16"/>
               </w:rPr>
-              <w:t>Environment Drift</w:t>
+              <w:t>Secret Management</w:t>
             </w:r>
           </w:p>
         </w:tc>
@@ -8663,7 +8380,7 @@
                 <w:sz w:val="16"/>
                 <w:szCs w:val="16"/>
               </w:rPr>
-              <w:t>Software works in staging but crashes in production due to OS or dependency mismatches.</w:t>
+              <w:t>Hardcoded credentials are leaked to source control, leading to unauthorized data breaches.</w:t>
             </w:r>
           </w:p>
         </w:tc>
@@ -8687,7 +8404,7 @@
                 <w:sz w:val="16"/>
                 <w:szCs w:val="16"/>
               </w:rPr>
-              <w:t>Infrastructure-as-Code (IaC) scripts and immutable container images.</w:t>
+              <w:t>Secrets injected at runtime; automated static analysis confirming no hardcoded keys.</w:t>
             </w:r>
           </w:p>
         </w:tc>
@@ -8711,7 +8428,7 @@
                 <w:sz w:val="16"/>
                 <w:szCs w:val="16"/>
               </w:rPr>
-              <w:t>Configuration drift monitoring and environment parity audits.</w:t>
+              <w:t>Audit logs of secret access and automated credential rotation metrics.</w:t>
             </w:r>
           </w:p>
         </w:tc>
@@ -8742,7 +8459,7 @@
                 <w:sz w:val="16"/>
                 <w:szCs w:val="16"/>
               </w:rPr>
-              <w:t>Secret Management</w:t>
+              <w:t>Deployment Automation</w:t>
             </w:r>
           </w:p>
         </w:tc>
@@ -8766,7 +8483,7 @@
                 <w:sz w:val="16"/>
                 <w:szCs w:val="16"/>
               </w:rPr>
-              <w:t>Hardcoded credentials are leaked to source control, leading to unauthorized data breaches.</w:t>
+              <w:t>Manual deployments cause extended downtime, human error, and inconsistent configurations.</w:t>
             </w:r>
           </w:p>
         </w:tc>
@@ -8790,7 +8507,7 @@
                 <w:sz w:val="16"/>
                 <w:szCs w:val="16"/>
               </w:rPr>
-              <w:t>Secrets injected at runtime; automated static analysis confirming no hardcoded keys.</w:t>
+              <w:t>Automated CI/CD pipeline logs; documented blue-green or canary deployment strategy.</w:t>
             </w:r>
           </w:p>
         </w:tc>
@@ -8814,128 +8531,7 @@
                 <w:sz w:val="16"/>
                 <w:szCs w:val="16"/>
               </w:rPr>
-              <w:t>Audit logs of secret access and automated credential rotation metrics.</w:t>
-            </w:r>
-          </w:p>
-        </w:tc>
-      </w:tr>
-      <w:tr>
-        <w:tc>
-          <w:tcPr>
-            <w:tcW w:w="0" w:type="auto"/>
-            <w:shd w:val="clear" w:color="auto" w:fill="0E2841" w:themeFill="text2"/>
-          </w:tcPr>
-          <w:p>
-            <w:pPr>
-              <w:pStyle w:val="ListParagraph"/>
-              <w:ind w:left="0"/>
-              <w:rPr>
-                <w:rFonts w:ascii="Times New Roman" w:hAnsi="Times New Roman" w:cs="Times New Roman"/>
-                <w:b/>
-                <w:bCs/>
-                <w:sz w:val="16"/>
-                <w:szCs w:val="16"/>
-              </w:rPr>
-            </w:pPr>
-            <w:r>
-              <w:rPr>
-                <w:rFonts w:ascii="Times New Roman" w:hAnsi="Times New Roman" w:cs="Times New Roman"/>
-                <w:b/>
-                <w:bCs/>
-                <w:sz w:val="16"/>
-                <w:szCs w:val="16"/>
-              </w:rPr>
-              <w:t>Deployment Automation</w:t>
-            </w:r>
-          </w:p>
-        </w:tc>
-        <w:tc>
-          <w:tcPr>
-            <w:tcW w:w="0" w:type="auto"/>
-          </w:tcPr>
-          <w:p>
-            <w:pPr>
-              <w:pStyle w:val="ListParagraph"/>
-              <w:ind w:left="0"/>
-              <w:rPr>
-                <w:rFonts w:ascii="Times New Roman" w:hAnsi="Times New Roman" w:cs="Times New Roman"/>
-                <w:sz w:val="16"/>
-                <w:szCs w:val="16"/>
-              </w:rPr>
-            </w:pPr>
-            <w:r>
-              <w:rPr>
-                <w:rFonts w:ascii="Times New Roman" w:hAnsi="Times New Roman" w:cs="Times New Roman"/>
-                <w:sz w:val="16"/>
-                <w:szCs w:val="16"/>
-              </w:rPr>
-              <w:t>Manual deployments cause extended downtime, human error, and inconsistent configurations.</w:t>
-            </w:r>
-          </w:p>
-        </w:tc>
-        <w:tc>
-          <w:tcPr>
-            <w:tcW w:w="0" w:type="auto"/>
-          </w:tcPr>
-          <w:p>
-            <w:pPr>
-              <w:pStyle w:val="ListParagraph"/>
-              <w:ind w:left="0"/>
-              <w:rPr>
-                <w:rFonts w:ascii="Times New Roman" w:hAnsi="Times New Roman" w:cs="Times New Roman"/>
-                <w:sz w:val="16"/>
-                <w:szCs w:val="16"/>
-              </w:rPr>
-            </w:pPr>
-            <w:r>
-              <w:rPr>
-                <w:rFonts w:ascii="Times New Roman" w:hAnsi="Times New Roman" w:cs="Times New Roman"/>
-                <w:sz w:val="16"/>
-                <w:szCs w:val="16"/>
-              </w:rPr>
-              <w:t>Automated CI/CD pipeline logs; documented blue-green or canary deployment strategy.</w:t>
-            </w:r>
-          </w:p>
-        </w:tc>
-        <w:tc>
-          <w:tcPr>
-            <w:tcW w:w="0" w:type="auto"/>
-          </w:tcPr>
-          <w:p>
-            <w:pPr>
-              <w:pStyle w:val="ListParagraph"/>
-              <w:ind w:left="0"/>
-              <w:rPr>
-                <w:rFonts w:ascii="Times New Roman" w:hAnsi="Times New Roman" w:cs="Times New Roman"/>
-                <w:sz w:val="16"/>
-                <w:szCs w:val="16"/>
-              </w:rPr>
-            </w:pPr>
-            <w:r>
-              <w:rPr>
-                <w:rFonts w:ascii="Times New Roman" w:hAnsi="Times New Roman" w:cs="Times New Roman"/>
-                <w:sz w:val="16"/>
-                <w:szCs w:val="16"/>
-              </w:rPr>
-              <w:t xml:space="preserve">Deployment frequency, success rate, and Mean Time </w:t>
-            </w:r>
-            <w:proofErr w:type="gramStart"/>
-            <w:r>
-              <w:rPr>
-                <w:rFonts w:ascii="Times New Roman" w:hAnsi="Times New Roman" w:cs="Times New Roman"/>
-                <w:sz w:val="16"/>
-                <w:szCs w:val="16"/>
-              </w:rPr>
-              <w:t>To</w:t>
-            </w:r>
-            <w:proofErr w:type="gramEnd"/>
-            <w:r>
-              <w:rPr>
-                <w:rFonts w:ascii="Times New Roman" w:hAnsi="Times New Roman" w:cs="Times New Roman"/>
-                <w:sz w:val="16"/>
-                <w:szCs w:val="16"/>
-              </w:rPr>
-              <w:t xml:space="preserve"> Recovery (MTTR) for failed releases.</w:t>
+              <w:t>Deployment frequency, success rate, and Mean Time To Recovery (MTTR) for failed releases.</w:t>
             </w:r>
           </w:p>
         </w:tc>
@@ -9303,29 +8899,7 @@
           <w:sz w:val="16"/>
           <w:szCs w:val="16"/>
         </w:rPr>
-        <w:t xml:space="preserve">Why can software that passes functional tests and runs successfully on a </w:t>
-      </w:r>
-      <w:proofErr w:type="gramStart"/>
-      <w:r>
-        <w:rPr>
-          <w:rFonts w:ascii="Times New Roman" w:hAnsi="Times New Roman" w:cs="Times New Roman"/>
-          <w:b/>
-          <w:bCs/>
-          <w:sz w:val="16"/>
-          <w:szCs w:val="16"/>
-        </w:rPr>
-        <w:t>developers</w:t>
-      </w:r>
-      <w:proofErr w:type="gramEnd"/>
-      <w:r>
-        <w:rPr>
-          <w:rFonts w:ascii="Times New Roman" w:hAnsi="Times New Roman" w:cs="Times New Roman"/>
-          <w:b/>
-          <w:bCs/>
-          <w:sz w:val="16"/>
-          <w:szCs w:val="16"/>
-        </w:rPr>
-        <w:t xml:space="preserve"> machine still be unready for production? </w:t>
+        <w:t xml:space="preserve">Why can software that passes functional tests and runs successfully on a developers machine still be unready for production? </w:t>
       </w:r>
     </w:p>
     <w:p>
@@ -9342,25 +8916,7 @@
           <w:sz w:val="16"/>
           <w:szCs w:val="16"/>
         </w:rPr>
-        <w:t xml:space="preserve">Software that works perfectly on a </w:t>
-      </w:r>
-      <w:proofErr w:type="gramStart"/>
-      <w:r>
-        <w:rPr>
-          <w:rFonts w:ascii="Times New Roman" w:hAnsi="Times New Roman" w:cs="Times New Roman"/>
-          <w:sz w:val="16"/>
-          <w:szCs w:val="16"/>
-        </w:rPr>
-        <w:t>developers</w:t>
-      </w:r>
-      <w:proofErr w:type="gramEnd"/>
-      <w:r>
-        <w:rPr>
-          <w:rFonts w:ascii="Times New Roman" w:hAnsi="Times New Roman" w:cs="Times New Roman"/>
-          <w:sz w:val="16"/>
-          <w:szCs w:val="16"/>
-        </w:rPr>
-        <w:t xml:space="preserve"> machine relies on hidden state. This means local environment variables, implicit dependencies and unconstrained computing resources play a role in why it runs perfectly. It is also being run with a single-user load. The functional tests confirm that the code’s logic is correct, they do not prove that the system can survive latency, recover well from hardware failure, scale securely under heavier concurrent traffic or be monitored effectively by an operations team. This proves that production readiness is not a measure of code correctness but rather it is a measure of operational resilience. </w:t>
+        <w:t xml:space="preserve">Software that works perfectly on a developers machine relies on hidden state. This means local environment variables, implicit dependencies and unconstrained computing resources play a role in why it runs perfectly. It is also being run with a single-user load. The functional tests confirm that the code’s logic is correct, they do not prove that the system can survive latency, recover well from hardware failure, scale securely under heavier concurrent traffic or be monitored effectively by an operations team. This proves that production readiness is not a measure of code correctness but rather it is a measure of operational resilience. </w:t>
       </w:r>
     </w:p>
     <w:p>
@@ -9648,25 +9204,7 @@
                 <w:sz w:val="16"/>
                 <w:szCs w:val="16"/>
               </w:rPr>
-              <w:t xml:space="preserve">Which test types will be used for the </w:t>
-            </w:r>
-            <w:proofErr w:type="spellStart"/>
-            <w:r>
-              <w:rPr>
-                <w:rFonts w:ascii="Times New Roman" w:hAnsi="Times New Roman" w:cs="Times New Roman"/>
-                <w:sz w:val="16"/>
-                <w:szCs w:val="16"/>
-              </w:rPr>
-              <w:t>CivicConnect</w:t>
-            </w:r>
-            <w:proofErr w:type="spellEnd"/>
-            <w:r>
-              <w:rPr>
-                <w:rFonts w:ascii="Times New Roman" w:hAnsi="Times New Roman" w:cs="Times New Roman"/>
-                <w:sz w:val="16"/>
-                <w:szCs w:val="16"/>
-              </w:rPr>
-              <w:t>.</w:t>
+              <w:t>Which test types will be used for the CivicConnect.</w:t>
             </w:r>
           </w:p>
         </w:tc>
@@ -9778,25 +9316,7 @@
                 <w:sz w:val="16"/>
                 <w:szCs w:val="16"/>
               </w:rPr>
-              <w:t xml:space="preserve">What quality gates is a must for </w:t>
-            </w:r>
-            <w:proofErr w:type="spellStart"/>
-            <w:r>
-              <w:rPr>
-                <w:rFonts w:ascii="Times New Roman" w:hAnsi="Times New Roman" w:cs="Times New Roman"/>
-                <w:sz w:val="16"/>
-                <w:szCs w:val="16"/>
-              </w:rPr>
-              <w:t>CivicConnect</w:t>
-            </w:r>
-            <w:proofErr w:type="spellEnd"/>
-            <w:r>
-              <w:rPr>
-                <w:rFonts w:ascii="Times New Roman" w:hAnsi="Times New Roman" w:cs="Times New Roman"/>
-                <w:sz w:val="16"/>
-                <w:szCs w:val="16"/>
-              </w:rPr>
-              <w:t xml:space="preserve"> before deployment is ready.</w:t>
+              <w:t>What quality gates is a must for CivicConnect before deployment is ready.</w:t>
             </w:r>
           </w:p>
         </w:tc>
@@ -9908,25 +9428,7 @@
                 <w:sz w:val="16"/>
                 <w:szCs w:val="16"/>
               </w:rPr>
-              <w:t xml:space="preserve">Team still needs to decide what level of authorization is required for every role in the </w:t>
-            </w:r>
-            <w:proofErr w:type="spellStart"/>
-            <w:r>
-              <w:rPr>
-                <w:rFonts w:ascii="Times New Roman" w:hAnsi="Times New Roman" w:cs="Times New Roman"/>
-                <w:sz w:val="16"/>
-                <w:szCs w:val="16"/>
-              </w:rPr>
-              <w:t>CivicConnect</w:t>
-            </w:r>
-            <w:proofErr w:type="spellEnd"/>
-            <w:r>
-              <w:rPr>
-                <w:rFonts w:ascii="Times New Roman" w:hAnsi="Times New Roman" w:cs="Times New Roman"/>
-                <w:sz w:val="16"/>
-                <w:szCs w:val="16"/>
-              </w:rPr>
-              <w:t>.</w:t>
+              <w:t>Team still needs to decide what level of authorization is required for every role in the CivicConnect.</w:t>
             </w:r>
           </w:p>
         </w:tc>
@@ -10038,25 +9540,7 @@
                 <w:sz w:val="16"/>
                 <w:szCs w:val="16"/>
               </w:rPr>
-              <w:t xml:space="preserve">Team of </w:t>
-            </w:r>
-            <w:proofErr w:type="spellStart"/>
-            <w:r>
-              <w:rPr>
-                <w:rFonts w:ascii="Times New Roman" w:hAnsi="Times New Roman" w:cs="Times New Roman"/>
-                <w:sz w:val="16"/>
-                <w:szCs w:val="16"/>
-              </w:rPr>
-              <w:t>CivicConnect</w:t>
-            </w:r>
-            <w:proofErr w:type="spellEnd"/>
-            <w:r>
-              <w:rPr>
-                <w:rFonts w:ascii="Times New Roman" w:hAnsi="Times New Roman" w:cs="Times New Roman"/>
-                <w:sz w:val="16"/>
-                <w:szCs w:val="16"/>
-              </w:rPr>
-              <w:t xml:space="preserve"> must still choose where secrets should be stored and who may access them.</w:t>
+              <w:t>Team of CivicConnect must still choose where secrets should be stored and who may access them.</w:t>
             </w:r>
           </w:p>
         </w:tc>
@@ -10283,23 +9767,13 @@
                 <w:szCs w:val="16"/>
               </w:rPr>
             </w:pPr>
-            <w:proofErr w:type="spellStart"/>
-            <w:r>
-              <w:rPr>
-                <w:rFonts w:ascii="Times New Roman" w:hAnsi="Times New Roman" w:cs="Times New Roman"/>
-                <w:sz w:val="16"/>
-                <w:szCs w:val="16"/>
-              </w:rPr>
-              <w:t>CivicConnect</w:t>
-            </w:r>
-            <w:proofErr w:type="spellEnd"/>
-            <w:r>
-              <w:rPr>
-                <w:rFonts w:ascii="Times New Roman" w:hAnsi="Times New Roman" w:cs="Times New Roman"/>
-                <w:sz w:val="16"/>
-                <w:szCs w:val="16"/>
-              </w:rPr>
-              <w:t xml:space="preserve"> team should still decide what indicators should be used to verify if platform is not ready for deployment.</w:t>
+            <w:r>
+              <w:rPr>
+                <w:rFonts w:ascii="Times New Roman" w:hAnsi="Times New Roman" w:cs="Times New Roman"/>
+                <w:sz w:val="16"/>
+                <w:szCs w:val="16"/>
+              </w:rPr>
+              <w:t>CivicConnect team should still decide what indicators should be used to verify if platform is not ready for deployment.</w:t>
             </w:r>
           </w:p>
         </w:tc>
@@ -11141,34 +10615,14 @@
                 <w:szCs w:val="14"/>
               </w:rPr>
             </w:pPr>
-            <w:proofErr w:type="spellStart"/>
-            <w:r>
-              <w:rPr>
-                <w:rFonts w:ascii="Times New Roman" w:hAnsi="Times New Roman" w:cs="Times New Roman"/>
-                <w:sz w:val="14"/>
-                <w:szCs w:val="14"/>
-              </w:rPr>
-              <w:t>Mohau</w:t>
-            </w:r>
-            <w:proofErr w:type="spellEnd"/>
-            <w:r>
-              <w:rPr>
-                <w:rFonts w:ascii="Times New Roman" w:hAnsi="Times New Roman" w:cs="Times New Roman"/>
-                <w:sz w:val="14"/>
-                <w:szCs w:val="14"/>
-              </w:rPr>
-              <w:t xml:space="preserve"> Drew </w:t>
-            </w:r>
-            <w:proofErr w:type="spellStart"/>
-            <w:r>
-              <w:rPr>
-                <w:rFonts w:ascii="Times New Roman" w:hAnsi="Times New Roman" w:cs="Times New Roman"/>
-                <w:sz w:val="14"/>
-                <w:szCs w:val="14"/>
-              </w:rPr>
-              <w:t>Modiselle</w:t>
-            </w:r>
-            <w:proofErr w:type="spellEnd"/>
+            <w:r>
+              <w:rPr>
+                <w:rFonts w:ascii="Times New Roman" w:hAnsi="Times New Roman" w:cs="Times New Roman"/>
+                <w:sz w:val="14"/>
+                <w:szCs w:val="14"/>
+              </w:rPr>
+              <w:t>Mohau Drew Modiselle</w:t>
+            </w:r>
           </w:p>
         </w:tc>
         <w:tc>
@@ -11339,41 +10793,13 @@
                 <w:szCs w:val="14"/>
               </w:rPr>
             </w:pPr>
-            <w:proofErr w:type="spellStart"/>
-            <w:r>
-              <w:rPr>
-                <w:rFonts w:ascii="Times New Roman" w:hAnsi="Times New Roman" w:cs="Times New Roman"/>
-                <w:sz w:val="14"/>
-                <w:szCs w:val="14"/>
-              </w:rPr>
-              <w:t>Mohau</w:t>
-            </w:r>
-            <w:proofErr w:type="spellEnd"/>
-            <w:r>
-              <w:rPr>
-                <w:rFonts w:ascii="Times New Roman" w:hAnsi="Times New Roman" w:cs="Times New Roman"/>
-                <w:sz w:val="14"/>
-                <w:szCs w:val="14"/>
-              </w:rPr>
-              <w:t xml:space="preserve"> Drew </w:t>
-            </w:r>
-            <w:proofErr w:type="spellStart"/>
-            <w:r>
-              <w:rPr>
-                <w:rFonts w:ascii="Times New Roman" w:hAnsi="Times New Roman" w:cs="Times New Roman"/>
-                <w:sz w:val="14"/>
-                <w:szCs w:val="14"/>
-              </w:rPr>
-              <w:t>Modiselle</w:t>
-            </w:r>
-            <w:proofErr w:type="spellEnd"/>
-            <w:r>
-              <w:rPr>
-                <w:rFonts w:ascii="Times New Roman" w:hAnsi="Times New Roman" w:cs="Times New Roman"/>
-                <w:sz w:val="14"/>
-                <w:szCs w:val="14"/>
-              </w:rPr>
-              <w:t xml:space="preserve"> </w:t>
+            <w:r>
+              <w:rPr>
+                <w:rFonts w:ascii="Times New Roman" w:hAnsi="Times New Roman" w:cs="Times New Roman"/>
+                <w:sz w:val="14"/>
+                <w:szCs w:val="14"/>
+              </w:rPr>
+              <w:t xml:space="preserve">Mohau Drew Modiselle </w:t>
             </w:r>
           </w:p>
         </w:tc>
@@ -12167,7 +11593,7 @@
                 <w:sz w:val="14"/>
                 <w:szCs w:val="14"/>
               </w:rPr>
-              <w:t>Ask assistance to generate suggestions for question 4 answers from our own document.</w:t>
+              <w:t>Ask assistance to generate 10 suggestions for question 4 answers from our own document.</w:t>
             </w:r>
           </w:p>
         </w:tc>
@@ -12189,7 +11615,7 @@
                 <w:sz w:val="14"/>
                 <w:szCs w:val="14"/>
               </w:rPr>
-              <w:t>Provided 10 suggestions.</w:t>
+              <w:t>Chose 6 suggestions.</w:t>
             </w:r>
           </w:p>
         </w:tc>
@@ -12233,7 +11659,7 @@
                 <w:sz w:val="14"/>
                 <w:szCs w:val="14"/>
               </w:rPr>
-              <w:t>Accepted most suggestions since they are aligned with the document, changed one that is not 100% from the document.</w:t>
+              <w:t>Accepted most suggestions since they are aligned with the document, changed one that is not 100% from the document. Paraphrased the work.</w:t>
             </w:r>
           </w:p>
         </w:tc>
@@ -12293,25 +11719,7 @@
           <w:sz w:val="16"/>
           <w:szCs w:val="16"/>
         </w:rPr>
-        <w:t xml:space="preserve">Ambler, S. &amp; </w:t>
-      </w:r>
-      <w:proofErr w:type="spellStart"/>
-      <w:r>
-        <w:rPr>
-          <w:rFonts w:ascii="Times New Roman" w:hAnsi="Times New Roman" w:cs="Times New Roman"/>
-          <w:sz w:val="16"/>
-          <w:szCs w:val="16"/>
-        </w:rPr>
-        <w:t>Sadalage</w:t>
-      </w:r>
-      <w:proofErr w:type="spellEnd"/>
-      <w:r>
-        <w:rPr>
-          <w:rFonts w:ascii="Times New Roman" w:hAnsi="Times New Roman" w:cs="Times New Roman"/>
-          <w:sz w:val="16"/>
-          <w:szCs w:val="16"/>
-        </w:rPr>
-        <w:t>, P. (2006). Refactoring Databases: Evolutionary Database Design. Addison-Wesley Professional.</w:t>
+        <w:t>Ambler, S. &amp; Sadalage, P. (2006). Refactoring Databases: Evolutionary Database Design. Addison-Wesley Professional.</w:t>
       </w:r>
     </w:p>
     <w:sdt>
@@ -12322,7 +11730,6 @@
         <w:id w:val="-573587230"/>
         <w:bibliography/>
       </w:sdtPr>
-      <w:sdtEndPr/>
       <w:sdtContent>
         <w:p>
           <w:pPr>
@@ -12852,25 +12259,7 @@
               <w:sz w:val="16"/>
               <w:szCs w:val="16"/>
             </w:rPr>
-            <w:t xml:space="preserve">Scandariato, R., Wuyts, K. and Joosen, W. (2015) 'A descriptive study of Microsoft's threat </w:t>
-          </w:r>
-          <w:proofErr w:type="spellStart"/>
-          <w:r>
-            <w:rPr>
-              <w:rFonts w:ascii="Times New Roman" w:hAnsi="Times New Roman" w:cs="Times New Roman"/>
-              <w:sz w:val="16"/>
-              <w:szCs w:val="16"/>
-            </w:rPr>
-            <w:t>modeling</w:t>
-          </w:r>
-          <w:proofErr w:type="spellEnd"/>
-          <w:r>
-            <w:rPr>
-              <w:rFonts w:ascii="Times New Roman" w:hAnsi="Times New Roman" w:cs="Times New Roman"/>
-              <w:sz w:val="16"/>
-              <w:szCs w:val="16"/>
-            </w:rPr>
-            <w:t xml:space="preserve"> technique', Requirements Engineering, 20, pp. 163-180. doi:10.1007/s00766-013-0195-2. </w:t>
+            <w:t xml:space="preserve">Scandariato, R., Wuyts, K. and Joosen, W. (2015) 'A descriptive study of Microsoft's threat modeling technique', Requirements Engineering, 20, pp. 163-180. doi:10.1007/s00766-013-0195-2. </w:t>
           </w:r>
           <w:hyperlink r:id="rId15" w:history="1">
             <w:r>
@@ -12892,23 +12281,13 @@
               <w:szCs w:val="16"/>
             </w:rPr>
           </w:pPr>
-          <w:proofErr w:type="spellStart"/>
           <w:r>
             <w:rPr>
               <w:rFonts w:ascii="Times New Roman" w:hAnsi="Times New Roman" w:cs="Times New Roman"/>
               <w:sz w:val="16"/>
               <w:szCs w:val="16"/>
             </w:rPr>
-            <w:t>Souppaya</w:t>
-          </w:r>
-          <w:proofErr w:type="spellEnd"/>
-          <w:r>
-            <w:rPr>
-              <w:rFonts w:ascii="Times New Roman" w:hAnsi="Times New Roman" w:cs="Times New Roman"/>
-              <w:sz w:val="16"/>
-              <w:szCs w:val="16"/>
-            </w:rPr>
-            <w:t xml:space="preserve">, M., Scarfone, K. and Dodson, D. (2022) Secure Software Development Framework (SSDF) Version 1.1. NIST Special Publication 800-218. doi:10.6028/NIST.SP.800-218. </w:t>
+            <w:t xml:space="preserve">Souppaya, M., Scarfone, K. and Dodson, D. (2022) Secure Software Development Framework (SSDF) Version 1.1. NIST Special Publication 800-218. doi:10.6028/NIST.SP.800-218. </w:t>
           </w:r>
           <w:hyperlink r:id="rId16" w:history="1">
             <w:r>
@@ -12930,23 +12309,13 @@
               <w:szCs w:val="16"/>
             </w:rPr>
           </w:pPr>
-          <w:proofErr w:type="spellStart"/>
           <w:r>
             <w:rPr>
               <w:rFonts w:ascii="Times New Roman" w:hAnsi="Times New Roman" w:cs="Times New Roman"/>
               <w:sz w:val="16"/>
               <w:szCs w:val="16"/>
             </w:rPr>
-            <w:t>Temoshok</w:t>
-          </w:r>
-          <w:proofErr w:type="spellEnd"/>
-          <w:r>
-            <w:rPr>
-              <w:rFonts w:ascii="Times New Roman" w:hAnsi="Times New Roman" w:cs="Times New Roman"/>
-              <w:sz w:val="16"/>
-              <w:szCs w:val="16"/>
-            </w:rPr>
-            <w:t xml:space="preserve">, D., Fenton, J.L., Choong, Y.Y., Lefkovitz, N., Regenscheid, A., Galluzzo, R. and Richer, J. (2025) Digital Identity Guidelines: Authentication and Authenticator Management. NIST Special Publication 800-63B-4. doi:10.6028/NIST.SP.800-63B-4. </w:t>
+            <w:t xml:space="preserve">Temoshok, D., Fenton, J.L., Choong, Y.Y., Lefkovitz, N., Regenscheid, A., Galluzzo, R. and Richer, J. (2025) Digital Identity Guidelines: Authentication and Authenticator Management. NIST Special Publication 800-63B-4. doi:10.6028/NIST.SP.800-63B-4. </w:t>
           </w:r>
           <w:hyperlink r:id="rId17" w:history="1">
             <w:r>
@@ -13059,7 +12428,6 @@
         <w:docPartUnique/>
       </w:docPartObj>
     </w:sdtPr>
-    <w:sdtEndPr/>
     <w:sdtContent>
       <w:p>
         <w:pPr>

</xml_diff>